<commit_message>
Rebrand do vertical cannabis: Gota Verde, com dominio gratis workers.dev
Nome fechado pelo dono (Gota Verde, descritor 'cannabis medicinal com
evidencia'); Greengo descartado por conflito com marca holandesa de
sedas e associacao recreativa. Worker renomeado para 'gotaverde' — o
site sobe no dominio gratuito gotaverde.<conta>.workers.dev. Site, app
Expo, worker do gate, deck PPTX e docs atualizados; icone novo em forma
de gota.

Co-Authored-By: Claude <noreply@anthropic.com>
Claude-Session: https://claude.ai/code/session_018WZd4PZy53xqMaYcFDrxLe
</commit_message>
<xml_diff>
--- a/docs/cannabis/DEMO_SOCIOS.docx
+++ b/docs/cannabis/DEMO_SOCIOS.docx
@@ -12,7 +12,7 @@
           <w:b/>
           <w:bCs/>
         </w:rPr>
-        <w:t xml:space="preserve">ROTEIRO DE DEMONSTRACAO PARA SOCIOS — CINALA VERDE</w:t>
+        <w:t xml:space="preserve">ROTEIRO DE DEMONSTRACAO PARA SOCIOS — GOTA VERDE</w:t>
       </w:r>
     </w:p>
     <w:p>
@@ -66,7 +66,7 @@
         <w:t xml:space="preserve">2. </w:t>
       </w:r>
       <w:r>
-        <w:t xml:space="preserve">Se o Worker ainda nao foi publicado: seguir `apps/cannabis-demo/PUBLICAR.md` (secrets + `wrangler deploy`). URL final: `cannabis-demo.&lt;conta&gt;.workers.dev`.</w:t>
+        <w:t xml:space="preserve">Se o Worker ainda nao foi publicado: seguir `apps/cannabis-demo/PUBLICAR.md` (secrets + `wrangler deploy`). URL final: `gotaverde.&lt;conta&gt;.workers.dev`.</w:t>
       </w:r>
     </w:p>
     <w:p>
@@ -114,7 +114,7 @@
         <w:t xml:space="preserve">5. </w:t>
       </w:r>
       <w:r>
-        <w:t xml:space="preserve">Deck PPTX (`DECK_INVESTIDORES_CINALA.pptx`) aberto como reserva offline, caso a internet falhe.</w:t>
+        <w:t xml:space="preserve">Deck PPTX (`DECK_INVESTIDORES_GOTAVERDE.pptx`) aberto como reserva offline, caso a internet falhe.</w:t>
       </w:r>
     </w:p>
     <w:p>
@@ -549,7 +549,7 @@
         <w:t xml:space="preserve">3. </w:t>
       </w:r>
       <w:r>
-        <w:t xml:space="preserve">Codigo de acesso do app demo: `cinala2026` (trocavel via `EXPO_PUBLIC_ACCESS_CODE`).</w:t>
+        <w:t xml:space="preserve">Codigo de acesso do app demo: `gotaverde2026` (trocavel via `EXPO_PUBLIC_ACCESS_CODE`).</w:t>
       </w:r>
     </w:p>
     <w:p>

</xml_diff>